<commit_message>
Printed page numbers for documents with several restarting sections; matching example screenshots
Co-Authored-By: Claude Sonnet 5.5 <noreply@anthropic.com>
</commit_message>
<xml_diff>
--- a/examples/Loper Bright v Raimondo (highlights).docx
+++ b/examples/Loper Bright v Raimondo (highlights).docx
@@ -48,7 +48,7 @@
         <w:rPr>
           <w:b/>
         </w:rPr>
-        <w:t>Excerpt 1 — PDF page 9</w:t>
+        <w:t>Excerpt 1 — PDF page 9 (printed page 1)</w:t>
       </w:r>
     </w:p>
     <w:p>
@@ -75,7 +75,7 @@
         <w:rPr>
           <w:b/>
         </w:rPr>
-        <w:t>Excerpt 2 — PDF page 15</w:t>
+        <w:t>Excerpt 2 — PDF page 15 (printed page 7)</w:t>
       </w:r>
     </w:p>
     <w:p>
@@ -105,7 +105,7 @@
         <w:rPr>
           <w:b/>
         </w:rPr>
-        <w:t>Excerpt 3 — PDF page 22</w:t>
+        <w:t>Excerpt 3 — PDF page 22 (printed page 14)</w:t>
       </w:r>
     </w:p>
     <w:p>
@@ -135,7 +135,7 @@
         <w:rPr>
           <w:b/>
         </w:rPr>
-        <w:t>Excerpt 4 — PDF page 24</w:t>
+        <w:t>Excerpt 4 — PDF page 24 (printed page 16)</w:t>
       </w:r>
     </w:p>
     <w:p>
@@ -178,7 +178,7 @@
         <w:rPr>
           <w:b/>
         </w:rPr>
-        <w:t>Excerpt 5 — PDF page 31</w:t>
+        <w:t>Excerpt 5 — PDF page 31 (printed page 23)</w:t>
       </w:r>
     </w:p>
     <w:p>
@@ -208,7 +208,7 @@
         <w:rPr>
           <w:b/>
         </w:rPr>
-        <w:t>Excerpt 6 — PDF page 43</w:t>
+        <w:t>Excerpt 6 — PDF page 43 (printed page 35)</w:t>
       </w:r>
     </w:p>
     <w:p>

</xml_diff>